<commit_message>
To Set Default Color for Vertical BarChart and 7days inside Trouble Ticket Overview
</commit_message>
<xml_diff>
--- a/document/Trouble Ticket Overview/chart-view.docx
+++ b/document/Trouble Ticket Overview/chart-view.docx
@@ -163,15 +163,7 @@
     </w:p>
     <w:p>
       <w:r>
-        <w:t>                "</w:t>
-      </w:r>
-      <w:proofErr w:type="spellStart"/>
-      <w:r>
-        <w:t>in_progress</w:t>
-      </w:r>
-      <w:proofErr w:type="spellEnd"/>
-      <w:r>
-        <w:t>": 33,</w:t>
+        <w:t>                "in_progress": 33,</w:t>
       </w:r>
     </w:p>
     <w:p>
@@ -202,15 +194,7 @@
     </w:p>
     <w:p>
       <w:r>
-        <w:t>                "</w:t>
-      </w:r>
-      <w:proofErr w:type="spellStart"/>
-      <w:r>
-        <w:t>in_progress</w:t>
-      </w:r>
-      <w:proofErr w:type="spellEnd"/>
-      <w:r>
-        <w:t>": 48,</w:t>
+        <w:t>                "in_progress": 48,</w:t>
       </w:r>
     </w:p>
     <w:p>
@@ -240,15 +224,7 @@
     </w:p>
     <w:p>
       <w:r>
-        <w:t>                "</w:t>
-      </w:r>
-      <w:proofErr w:type="spellStart"/>
-      <w:r>
-        <w:t>in_progress</w:t>
-      </w:r>
-      <w:proofErr w:type="spellEnd"/>
-      <w:r>
-        <w:t>": 0,</w:t>
+        <w:t>                "in_progress": 0,</w:t>
       </w:r>
     </w:p>
     <w:p>
@@ -343,15 +319,7 @@
     </w:p>
     <w:p>
       <w:r>
-        <w:t>                "</w:t>
-      </w:r>
-      <w:proofErr w:type="spellStart"/>
-      <w:r>
-        <w:t>in_progress</w:t>
-      </w:r>
-      <w:proofErr w:type="spellEnd"/>
-      <w:r>
-        <w:t>": 0,</w:t>
+        <w:t>                "in_progress": 0,</w:t>
       </w:r>
     </w:p>
     <w:p>
@@ -381,15 +349,7 @@
     </w:p>
     <w:p>
       <w:r>
-        <w:t>                "</w:t>
-      </w:r>
-      <w:proofErr w:type="spellStart"/>
-      <w:r>
-        <w:t>in_progress</w:t>
-      </w:r>
-      <w:proofErr w:type="spellEnd"/>
-      <w:r>
-        <w:t>": 0,</w:t>
+        <w:t>                "in_progress": 0,</w:t>
       </w:r>
     </w:p>
     <w:p>
@@ -419,15 +379,7 @@
     </w:p>
     <w:p>
       <w:r>
-        <w:t>                "</w:t>
-      </w:r>
-      <w:proofErr w:type="spellStart"/>
-      <w:r>
-        <w:t>in_progress</w:t>
-      </w:r>
-      <w:proofErr w:type="spellEnd"/>
-      <w:r>
-        <w:t>": 0,</w:t>
+        <w:t>                "in_progress": 0,</w:t>
       </w:r>
     </w:p>
     <w:p>
@@ -457,15 +409,7 @@
     </w:p>
     <w:p>
       <w:r>
-        <w:t>                "</w:t>
-      </w:r>
-      <w:proofErr w:type="spellStart"/>
-      <w:r>
-        <w:t>in_progress</w:t>
-      </w:r>
-      <w:proofErr w:type="spellEnd"/>
-      <w:r>
-        <w:t>": 0,</w:t>
+        <w:t>                "in_progress": 0,</w:t>
       </w:r>
     </w:p>
     <w:p>
@@ -496,15 +440,7 @@
     <w:p>
       <w:r>
         <w:lastRenderedPageBreak/>
-        <w:t>                "</w:t>
-      </w:r>
-      <w:proofErr w:type="spellStart"/>
-      <w:r>
-        <w:t>in_progress</w:t>
-      </w:r>
-      <w:proofErr w:type="spellEnd"/>
-      <w:r>
-        <w:t>": 0,</w:t>
+        <w:t>                "in_progress": 0,</w:t>
       </w:r>
     </w:p>
     <w:p>
@@ -534,15 +470,7 @@
     </w:p>
     <w:p>
       <w:r>
-        <w:t>                "</w:t>
-      </w:r>
-      <w:proofErr w:type="spellStart"/>
-      <w:r>
-        <w:t>in_progress</w:t>
-      </w:r>
-      <w:proofErr w:type="spellEnd"/>
-      <w:r>
-        <w:t>": 0,</w:t>
+        <w:t>                "in_progress": 0,</w:t>
       </w:r>
     </w:p>
     <w:p>
@@ -572,15 +500,7 @@
     </w:p>
     <w:p>
       <w:r>
-        <w:t>                "</w:t>
-      </w:r>
-      <w:proofErr w:type="spellStart"/>
-      <w:r>
-        <w:t>in_progress</w:t>
-      </w:r>
-      <w:proofErr w:type="spellEnd"/>
-      <w:r>
-        <w:t>": 0,</w:t>
+        <w:t>                "in_progress": 0,</w:t>
       </w:r>
     </w:p>
     <w:p>
@@ -676,15 +596,7 @@
     </w:p>
     <w:p>
       <w:r>
-        <w:t>                "</w:t>
-      </w:r>
-      <w:proofErr w:type="spellStart"/>
-      <w:r>
-        <w:t>in_progress</w:t>
-      </w:r>
-      <w:proofErr w:type="spellEnd"/>
-      <w:r>
-        <w:t>": 0,</w:t>
+        <w:t>                "in_progress": 0,</w:t>
       </w:r>
     </w:p>
     <w:p>
@@ -714,15 +626,7 @@
     </w:p>
     <w:p>
       <w:r>
-        <w:t>                "</w:t>
-      </w:r>
-      <w:proofErr w:type="spellStart"/>
-      <w:r>
-        <w:t>in_progress</w:t>
-      </w:r>
-      <w:proofErr w:type="spellEnd"/>
-      <w:r>
-        <w:t>": 1,</w:t>
+        <w:t>                "in_progress": 1,</w:t>
       </w:r>
     </w:p>
     <w:p>
@@ -752,15 +656,7 @@
     </w:p>
     <w:p>
       <w:r>
-        <w:t>                "</w:t>
-      </w:r>
-      <w:proofErr w:type="spellStart"/>
-      <w:r>
-        <w:t>in_progress</w:t>
-      </w:r>
-      <w:proofErr w:type="spellEnd"/>
-      <w:r>
-        <w:t>": 1,</w:t>
+        <w:t>                "in_progress": 1,</w:t>
       </w:r>
     </w:p>
     <w:p>
@@ -790,15 +686,7 @@
     </w:p>
     <w:p>
       <w:r>
-        <w:t>                "</w:t>
-      </w:r>
-      <w:proofErr w:type="spellStart"/>
-      <w:r>
-        <w:t>in_progress</w:t>
-      </w:r>
-      <w:proofErr w:type="spellEnd"/>
-      <w:r>
-        <w:t>": 2,</w:t>
+        <w:t>                "in_progress": 2,</w:t>
       </w:r>
     </w:p>
     <w:p>
@@ -829,15 +717,7 @@
     </w:p>
     <w:p>
       <w:r>
-        <w:t>                "</w:t>
-      </w:r>
-      <w:proofErr w:type="spellStart"/>
-      <w:r>
-        <w:t>in_progress</w:t>
-      </w:r>
-      <w:proofErr w:type="spellEnd"/>
-      <w:r>
-        <w:t>": 2,</w:t>
+        <w:t>                "in_progress": 2,</w:t>
       </w:r>
     </w:p>
     <w:p>
@@ -867,15 +747,7 @@
     </w:p>
     <w:p>
       <w:r>
-        <w:t>                "</w:t>
-      </w:r>
-      <w:proofErr w:type="spellStart"/>
-      <w:r>
-        <w:t>in_progress</w:t>
-      </w:r>
-      <w:proofErr w:type="spellEnd"/>
-      <w:r>
-        <w:t>": 1,</w:t>
+        <w:t>                "in_progress": 1,</w:t>
       </w:r>
     </w:p>
     <w:p>
@@ -905,15 +777,7 @@
     </w:p>
     <w:p>
       <w:r>
-        <w:t>                "</w:t>
-      </w:r>
-      <w:proofErr w:type="spellStart"/>
-      <w:r>
-        <w:t>in_progress</w:t>
-      </w:r>
-      <w:proofErr w:type="spellEnd"/>
-      <w:r>
-        <w:t>": 0,</w:t>
+        <w:t>                "in_progress": 0,</w:t>
       </w:r>
     </w:p>
     <w:p>
@@ -943,15 +807,7 @@
     </w:p>
     <w:p>
       <w:r>
-        <w:t>                "</w:t>
-      </w:r>
-      <w:proofErr w:type="spellStart"/>
-      <w:r>
-        <w:t>in_progress</w:t>
-      </w:r>
-      <w:proofErr w:type="spellEnd"/>
-      <w:r>
-        <w:t>": 0,</w:t>
+        <w:t>                "in_progress": 0,</w:t>
       </w:r>
     </w:p>
     <w:p>
@@ -982,15 +838,7 @@
     </w:p>
     <w:p>
       <w:r>
-        <w:t>                "</w:t>
-      </w:r>
-      <w:proofErr w:type="spellStart"/>
-      <w:r>
-        <w:t>in_progress</w:t>
-      </w:r>
-      <w:proofErr w:type="spellEnd"/>
-      <w:r>
-        <w:t>": 2,</w:t>
+        <w:t>                "in_progress": 2,</w:t>
       </w:r>
     </w:p>
     <w:p>
@@ -1020,15 +868,7 @@
     </w:p>
     <w:p>
       <w:r>
-        <w:t>                "</w:t>
-      </w:r>
-      <w:proofErr w:type="spellStart"/>
-      <w:r>
-        <w:t>in_progress</w:t>
-      </w:r>
-      <w:proofErr w:type="spellEnd"/>
-      <w:r>
-        <w:t>": 1,</w:t>
+        <w:t>                "in_progress": 1,</w:t>
       </w:r>
     </w:p>
     <w:p>
@@ -1058,15 +898,7 @@
     </w:p>
     <w:p>
       <w:r>
-        <w:t>                "</w:t>
-      </w:r>
-      <w:proofErr w:type="spellStart"/>
-      <w:r>
-        <w:t>in_progress</w:t>
-      </w:r>
-      <w:proofErr w:type="spellEnd"/>
-      <w:r>
-        <w:t>": 6,</w:t>
+        <w:t>                "in_progress": 6,</w:t>
       </w:r>
     </w:p>
     <w:p>
@@ -1096,15 +928,7 @@
     </w:p>
     <w:p>
       <w:r>
-        <w:t>                "</w:t>
-      </w:r>
-      <w:proofErr w:type="spellStart"/>
-      <w:r>
-        <w:t>in_progress</w:t>
-      </w:r>
-      <w:proofErr w:type="spellEnd"/>
-      <w:r>
-        <w:t>": 5,</w:t>
+        <w:t>                "in_progress": 5,</w:t>
       </w:r>
     </w:p>
     <w:p>
@@ -1134,15 +958,7 @@
     </w:p>
     <w:p>
       <w:r>
-        <w:t>                "</w:t>
-      </w:r>
-      <w:proofErr w:type="spellStart"/>
-      <w:r>
-        <w:t>in_progress</w:t>
-      </w:r>
-      <w:proofErr w:type="spellEnd"/>
-      <w:r>
-        <w:t>": 4,</w:t>
+        <w:t>                "in_progress": 4,</w:t>
       </w:r>
     </w:p>
     <w:p>
@@ -1173,15 +989,7 @@
     </w:p>
     <w:p>
       <w:r>
-        <w:t>                "</w:t>
-      </w:r>
-      <w:proofErr w:type="spellStart"/>
-      <w:r>
-        <w:t>in_progress</w:t>
-      </w:r>
-      <w:proofErr w:type="spellEnd"/>
-      <w:r>
-        <w:t>": 1,</w:t>
+        <w:t>                "in_progress": 1,</w:t>
       </w:r>
     </w:p>
     <w:p>
@@ -1211,15 +1019,7 @@
     </w:p>
     <w:p>
       <w:r>
-        <w:t>                "</w:t>
-      </w:r>
-      <w:proofErr w:type="spellStart"/>
-      <w:r>
-        <w:t>in_progress</w:t>
-      </w:r>
-      <w:proofErr w:type="spellEnd"/>
-      <w:r>
-        <w:t>": 0,</w:t>
+        <w:t>                "in_progress": 0,</w:t>
       </w:r>
     </w:p>
     <w:p>
@@ -1249,15 +1049,7 @@
     </w:p>
     <w:p>
       <w:r>
-        <w:t>                "</w:t>
-      </w:r>
-      <w:proofErr w:type="spellStart"/>
-      <w:r>
-        <w:t>in_progress</w:t>
-      </w:r>
-      <w:proofErr w:type="spellEnd"/>
-      <w:r>
-        <w:t>": 5,</w:t>
+        <w:t>                "in_progress": 5,</w:t>
       </w:r>
     </w:p>
     <w:p>
@@ -1287,15 +1079,7 @@
     </w:p>
     <w:p>
       <w:r>
-        <w:t>                "</w:t>
-      </w:r>
-      <w:proofErr w:type="spellStart"/>
-      <w:r>
-        <w:t>in_progress</w:t>
-      </w:r>
-      <w:proofErr w:type="spellEnd"/>
-      <w:r>
-        <w:t>": 3,</w:t>
+        <w:t>                "in_progress": 3,</w:t>
       </w:r>
     </w:p>
     <w:p>
@@ -1326,15 +1110,7 @@
     </w:p>
     <w:p>
       <w:r>
-        <w:t>                "</w:t>
-      </w:r>
-      <w:proofErr w:type="spellStart"/>
-      <w:r>
-        <w:t>in_progress</w:t>
-      </w:r>
-      <w:proofErr w:type="spellEnd"/>
-      <w:r>
-        <w:t>": 2,</w:t>
+        <w:t>                "in_progress": 2,</w:t>
       </w:r>
     </w:p>
     <w:p>
@@ -1364,15 +1140,7 @@
     </w:p>
     <w:p>
       <w:r>
-        <w:t>                "</w:t>
-      </w:r>
-      <w:proofErr w:type="spellStart"/>
-      <w:r>
-        <w:t>in_progress</w:t>
-      </w:r>
-      <w:proofErr w:type="spellEnd"/>
-      <w:r>
-        <w:t>": 2,</w:t>
+        <w:t>                "in_progress": 2,</w:t>
       </w:r>
     </w:p>
     <w:p>
@@ -1402,15 +1170,7 @@
     </w:p>
     <w:p>
       <w:r>
-        <w:t>                "</w:t>
-      </w:r>
-      <w:proofErr w:type="spellStart"/>
-      <w:r>
-        <w:t>in_progress</w:t>
-      </w:r>
-      <w:proofErr w:type="spellEnd"/>
-      <w:r>
-        <w:t>": 3,</w:t>
+        <w:t>                "in_progress": 3,</w:t>
       </w:r>
     </w:p>
     <w:p>
@@ -1440,15 +1200,7 @@
     </w:p>
     <w:p>
       <w:r>
-        <w:t>                "</w:t>
-      </w:r>
-      <w:proofErr w:type="spellStart"/>
-      <w:r>
-        <w:t>in_progress</w:t>
-      </w:r>
-      <w:proofErr w:type="spellEnd"/>
-      <w:r>
-        <w:t>": 2,</w:t>
+        <w:t>                "in_progress": 2,</w:t>
       </w:r>
     </w:p>
     <w:p>
@@ -1479,15 +1231,7 @@
     </w:p>
     <w:p>
       <w:r>
-        <w:t>                "</w:t>
-      </w:r>
-      <w:proofErr w:type="spellStart"/>
-      <w:r>
-        <w:t>in_progress</w:t>
-      </w:r>
-      <w:proofErr w:type="spellEnd"/>
-      <w:r>
-        <w:t>": 0,</w:t>
+        <w:t>                "in_progress": 0,</w:t>
       </w:r>
     </w:p>
     <w:p>
@@ -1517,15 +1261,7 @@
     </w:p>
     <w:p>
       <w:r>
-        <w:t>                "</w:t>
-      </w:r>
-      <w:proofErr w:type="spellStart"/>
-      <w:r>
-        <w:t>in_progress</w:t>
-      </w:r>
-      <w:proofErr w:type="spellEnd"/>
-      <w:r>
-        <w:t>": 3,</w:t>
+        <w:t>                "in_progress": 3,</w:t>
       </w:r>
     </w:p>
     <w:p>
@@ -1555,15 +1291,7 @@
     </w:p>
     <w:p>
       <w:r>
-        <w:t>                "</w:t>
-      </w:r>
-      <w:proofErr w:type="spellStart"/>
-      <w:r>
-        <w:t>in_progress</w:t>
-      </w:r>
-      <w:proofErr w:type="spellEnd"/>
-      <w:r>
-        <w:t>": 0,</w:t>
+        <w:t>                "in_progress": 0,</w:t>
       </w:r>
     </w:p>
     <w:p>
@@ -1593,15 +1321,7 @@
     </w:p>
     <w:p>
       <w:r>
-        <w:t>                "</w:t>
-      </w:r>
-      <w:proofErr w:type="spellStart"/>
-      <w:r>
-        <w:t>in_progress</w:t>
-      </w:r>
-      <w:proofErr w:type="spellEnd"/>
-      <w:r>
-        <w:t>": 0,</w:t>
+        <w:t>                "in_progress": 0,</w:t>
       </w:r>
     </w:p>
     <w:p>
@@ -1631,15 +1351,7 @@
     </w:p>
     <w:p>
       <w:r>
-        <w:t>                "</w:t>
-      </w:r>
-      <w:proofErr w:type="spellStart"/>
-      <w:r>
-        <w:t>in_progress</w:t>
-      </w:r>
-      <w:proofErr w:type="spellEnd"/>
-      <w:r>
-        <w:t>": 0,</w:t>
+        <w:t>                "in_progress": 0,</w:t>
       </w:r>
     </w:p>
     <w:p>
@@ -1670,15 +1382,7 @@
     </w:p>
     <w:p>
       <w:r>
-        <w:t>                "</w:t>
-      </w:r>
-      <w:proofErr w:type="spellStart"/>
-      <w:r>
-        <w:t>in_progress</w:t>
-      </w:r>
-      <w:proofErr w:type="spellEnd"/>
-      <w:r>
-        <w:t>": 0,</w:t>
+        <w:t>                "in_progress": 0,</w:t>
       </w:r>
     </w:p>
     <w:p>
@@ -1708,15 +1412,7 @@
     </w:p>
     <w:p>
       <w:r>
-        <w:t>                "</w:t>
-      </w:r>
-      <w:proofErr w:type="spellStart"/>
-      <w:r>
-        <w:t>in_progress</w:t>
-      </w:r>
-      <w:proofErr w:type="spellEnd"/>
-      <w:r>
-        <w:t>": 0,</w:t>
+        <w:t>                "in_progress": 0,</w:t>
       </w:r>
     </w:p>
     <w:p>
@@ -1746,15 +1442,7 @@
     </w:p>
     <w:p>
       <w:r>
-        <w:t>                "</w:t>
-      </w:r>
-      <w:proofErr w:type="spellStart"/>
-      <w:r>
-        <w:t>in_progress</w:t>
-      </w:r>
-      <w:proofErr w:type="spellEnd"/>
-      <w:r>
-        <w:t>": 0,</w:t>
+        <w:t>                "in_progress": 0,</w:t>
       </w:r>
     </w:p>
     <w:p>
@@ -1784,15 +1472,7 @@
     </w:p>
     <w:p>
       <w:r>
-        <w:t>                "</w:t>
-      </w:r>
-      <w:proofErr w:type="spellStart"/>
-      <w:r>
-        <w:t>in_progress</w:t>
-      </w:r>
-      <w:proofErr w:type="spellEnd"/>
-      <w:r>
-        <w:t>": 0,</w:t>
+        <w:t>                "in_progress": 0,</w:t>
       </w:r>
     </w:p>
     <w:p>
@@ -1919,57 +1599,17 @@
     </w:p>
     <w:p>
       <w:r>
-        <w:t>The Bar chart should use the verified summary values for all four columns. In overview-</w:t>
-      </w:r>
-      <w:proofErr w:type="spellStart"/>
-      <w:r>
-        <w:t>chart.tsx</w:t>
-      </w:r>
-      <w:proofErr w:type="spellEnd"/>
-      <w:r>
-        <w:t xml:space="preserve">, replace your complete </w:t>
-      </w:r>
-      <w:proofErr w:type="spellStart"/>
-      <w:r>
-        <w:t>selectedRangeData</w:t>
-      </w:r>
-      <w:proofErr w:type="spellEnd"/>
-      <w:r>
-        <w:t xml:space="preserve"> block with:</w:t>
-      </w:r>
-    </w:p>
-    <w:p>
-      <w:r>
-        <w:t xml:space="preserve">const </w:t>
-      </w:r>
-      <w:proofErr w:type="spellStart"/>
-      <w:r>
-        <w:t>selectedRangeData</w:t>
-      </w:r>
-      <w:proofErr w:type="spellEnd"/>
-      <w:r>
-        <w:t xml:space="preserve"> =</w:t>
-      </w:r>
-    </w:p>
-    <w:p>
-      <w:r>
-        <w:t xml:space="preserve">    </w:t>
-      </w:r>
-      <w:proofErr w:type="spellStart"/>
-      <w:r>
-        <w:t>useMemo</w:t>
-      </w:r>
-      <w:proofErr w:type="spellEnd"/>
-      <w:r>
-        <w:t>&lt;</w:t>
-      </w:r>
-      <w:proofErr w:type="spellStart"/>
-      <w:r>
-        <w:t>TroubleTicketMetric</w:t>
-      </w:r>
-      <w:proofErr w:type="spellEnd"/>
-      <w:r>
-        <w:t>[]&gt;(</w:t>
+        <w:t>The Bar chart should use the verified summary values for all four columns. In overview-chart.tsx, replace your complete selectedRangeData block with:</w:t>
+      </w:r>
+    </w:p>
+    <w:p>
+      <w:r>
+        <w:t>const selectedRangeData =</w:t>
+      </w:r>
+    </w:p>
+    <w:p>
+      <w:r>
+        <w:t xml:space="preserve">    useMemo&lt;TroubleTicketMetric[]&gt;(</w:t>
       </w:r>
     </w:p>
     <w:p>
@@ -1989,15 +1629,7 @@
     </w:p>
     <w:p>
       <w:r>
-        <w:t xml:space="preserve">                </w:t>
-      </w:r>
-      <w:proofErr w:type="spellStart"/>
-      <w:r>
-        <w:t>shortLabel</w:t>
-      </w:r>
-      <w:proofErr w:type="spellEnd"/>
-      <w:r>
-        <w:t>: "Opened Today",</w:t>
+        <w:t xml:space="preserve">                shortLabel: "Opened Today",</w:t>
       </w:r>
     </w:p>
     <w:p>
@@ -2007,54 +1639,22 @@
     </w:p>
     <w:p>
       <w:r>
-        <w:t xml:space="preserve">                value: </w:t>
-      </w:r>
-      <w:proofErr w:type="spellStart"/>
-      <w:r>
-        <w:t>ticketSummary.opened_today</w:t>
-      </w:r>
-      <w:proofErr w:type="spellEnd"/>
-      <w:r>
-        <w:t>,</w:t>
-      </w:r>
-    </w:p>
-    <w:p>
-      <w:r>
-        <w:t xml:space="preserve">                color: </w:t>
-      </w:r>
-      <w:proofErr w:type="spellStart"/>
-      <w:r>
-        <w:t>COLORS.opened</w:t>
-      </w:r>
-      <w:proofErr w:type="spellEnd"/>
-      <w:r>
-        <w:t>,</w:t>
-      </w:r>
-    </w:p>
-    <w:p>
-      <w:r>
-        <w:t xml:space="preserve">                </w:t>
-      </w:r>
-      <w:proofErr w:type="spellStart"/>
-      <w:r>
-        <w:t>dotClass</w:t>
-      </w:r>
-      <w:proofErr w:type="spellEnd"/>
-      <w:r>
-        <w:t>: "bg-blue-600",</w:t>
-      </w:r>
-    </w:p>
-    <w:p>
-      <w:r>
-        <w:t xml:space="preserve">                </w:t>
-      </w:r>
-      <w:proofErr w:type="spellStart"/>
-      <w:r>
-        <w:t>valueClass</w:t>
-      </w:r>
-      <w:proofErr w:type="spellEnd"/>
-      <w:r>
-        <w:t>:</w:t>
+        <w:t xml:space="preserve">                value: ticketSummary.opened_today,</w:t>
+      </w:r>
+    </w:p>
+    <w:p>
+      <w:r>
+        <w:t xml:space="preserve">                color: COLORS.opened,</w:t>
+      </w:r>
+    </w:p>
+    <w:p>
+      <w:r>
+        <w:t xml:space="preserve">                dotClass: "bg-blue-600",</w:t>
+      </w:r>
+    </w:p>
+    <w:p>
+      <w:r>
+        <w:t xml:space="preserve">                valueClass:</w:t>
       </w:r>
     </w:p>
     <w:p>
@@ -2064,15 +1664,7 @@
     </w:p>
     <w:p>
       <w:r>
-        <w:t xml:space="preserve">                </w:t>
-      </w:r>
-      <w:proofErr w:type="spellStart"/>
-      <w:r>
-        <w:t>borderClass</w:t>
-      </w:r>
-      <w:proofErr w:type="spellEnd"/>
-      <w:r>
-        <w:t>:</w:t>
+        <w:t xml:space="preserve">                borderClass:</w:t>
       </w:r>
     </w:p>
     <w:p>
@@ -2082,15 +1674,7 @@
     </w:p>
     <w:p>
       <w:r>
-        <w:t xml:space="preserve">                </w:t>
-      </w:r>
-      <w:proofErr w:type="spellStart"/>
-      <w:r>
-        <w:t>backgroundClass</w:t>
-      </w:r>
-      <w:proofErr w:type="spellEnd"/>
-      <w:r>
-        <w:t>:</w:t>
+        <w:t xml:space="preserve">                backgroundClass:</w:t>
       </w:r>
     </w:p>
     <w:p>
@@ -2116,15 +1700,7 @@
     </w:p>
     <w:p>
       <w:r>
-        <w:t xml:space="preserve">                </w:t>
-      </w:r>
-      <w:proofErr w:type="spellStart"/>
-      <w:r>
-        <w:t>shortLabel</w:t>
-      </w:r>
-      <w:proofErr w:type="spellEnd"/>
-      <w:r>
-        <w:t>: "Closed Today",</w:t>
+        <w:t xml:space="preserve">                shortLabel: "Closed Today",</w:t>
       </w:r>
     </w:p>
     <w:p>
@@ -2134,54 +1710,22 @@
     </w:p>
     <w:p>
       <w:r>
-        <w:t xml:space="preserve">                value: </w:t>
-      </w:r>
-      <w:proofErr w:type="spellStart"/>
-      <w:r>
-        <w:t>ticketSummary.closed_today</w:t>
-      </w:r>
-      <w:proofErr w:type="spellEnd"/>
-      <w:r>
-        <w:t>,</w:t>
-      </w:r>
-    </w:p>
-    <w:p>
-      <w:r>
-        <w:t xml:space="preserve">                color: </w:t>
-      </w:r>
-      <w:proofErr w:type="spellStart"/>
-      <w:r>
-        <w:t>COLORS.closed</w:t>
-      </w:r>
-      <w:proofErr w:type="spellEnd"/>
-      <w:r>
-        <w:t>,</w:t>
-      </w:r>
-    </w:p>
-    <w:p>
-      <w:r>
-        <w:t xml:space="preserve">                </w:t>
-      </w:r>
-      <w:proofErr w:type="spellStart"/>
-      <w:r>
-        <w:t>dotClass</w:t>
-      </w:r>
-      <w:proofErr w:type="spellEnd"/>
-      <w:r>
-        <w:t>: "bg-emerald-500",</w:t>
-      </w:r>
-    </w:p>
-    <w:p>
-      <w:r>
-        <w:t xml:space="preserve">                </w:t>
-      </w:r>
-      <w:proofErr w:type="spellStart"/>
-      <w:r>
-        <w:t>valueClass</w:t>
-      </w:r>
-      <w:proofErr w:type="spellEnd"/>
-      <w:r>
-        <w:t>:</w:t>
+        <w:t xml:space="preserve">                value: ticketSummary.closed_today,</w:t>
+      </w:r>
+    </w:p>
+    <w:p>
+      <w:r>
+        <w:t xml:space="preserve">                color: COLORS.closed,</w:t>
+      </w:r>
+    </w:p>
+    <w:p>
+      <w:r>
+        <w:t xml:space="preserve">                dotClass: "bg-emerald-500",</w:t>
+      </w:r>
+    </w:p>
+    <w:p>
+      <w:r>
+        <w:t xml:space="preserve">                valueClass:</w:t>
       </w:r>
     </w:p>
     <w:p>
@@ -2191,15 +1735,7 @@
     </w:p>
     <w:p>
       <w:r>
-        <w:t xml:space="preserve">                </w:t>
-      </w:r>
-      <w:proofErr w:type="spellStart"/>
-      <w:r>
-        <w:t>borderClass</w:t>
-      </w:r>
-      <w:proofErr w:type="spellEnd"/>
-      <w:r>
-        <w:t>:</w:t>
+        <w:t xml:space="preserve">                borderClass:</w:t>
       </w:r>
     </w:p>
     <w:p>
@@ -2209,15 +1745,7 @@
     </w:p>
     <w:p>
       <w:r>
-        <w:t xml:space="preserve">                </w:t>
-      </w:r>
-      <w:proofErr w:type="spellStart"/>
-      <w:r>
-        <w:t>backgroundClass</w:t>
-      </w:r>
-      <w:proofErr w:type="spellEnd"/>
-      <w:r>
-        <w:t>:</w:t>
+        <w:t xml:space="preserve">                backgroundClass:</w:t>
       </w:r>
     </w:p>
     <w:p>
@@ -2242,15 +1770,7 @@
     </w:p>
     <w:p>
       <w:r>
-        <w:t xml:space="preserve">                </w:t>
-      </w:r>
-      <w:proofErr w:type="spellStart"/>
-      <w:r>
-        <w:t>shortLabel</w:t>
-      </w:r>
-      <w:proofErr w:type="spellEnd"/>
-      <w:r>
-        <w:t>: "Running TT",</w:t>
+        <w:t xml:space="preserve">                shortLabel: "Running TT",</w:t>
       </w:r>
     </w:p>
     <w:p>
@@ -2265,54 +1785,22 @@
     </w:p>
     <w:p>
       <w:r>
-        <w:t xml:space="preserve">                    </w:t>
-      </w:r>
-      <w:proofErr w:type="spellStart"/>
-      <w:r>
-        <w:t>ticketSummary.total_running_tt</w:t>
-      </w:r>
-      <w:proofErr w:type="spellEnd"/>
-      <w:r>
-        <w:t>,</w:t>
-      </w:r>
-    </w:p>
-    <w:p>
-      <w:r>
-        <w:t xml:space="preserve">                color: </w:t>
-      </w:r>
-      <w:proofErr w:type="spellStart"/>
-      <w:r>
-        <w:t>COLORS.running</w:t>
-      </w:r>
-      <w:proofErr w:type="spellEnd"/>
-      <w:r>
-        <w:t>,</w:t>
-      </w:r>
-    </w:p>
-    <w:p>
-      <w:r>
-        <w:t xml:space="preserve">                </w:t>
-      </w:r>
-      <w:proofErr w:type="spellStart"/>
-      <w:r>
-        <w:t>dotClass</w:t>
-      </w:r>
-      <w:proofErr w:type="spellEnd"/>
-      <w:r>
-        <w:t>: "bg-amber-500",</w:t>
-      </w:r>
-    </w:p>
-    <w:p>
-      <w:r>
-        <w:t xml:space="preserve">                </w:t>
-      </w:r>
-      <w:proofErr w:type="spellStart"/>
-      <w:r>
-        <w:t>valueClass</w:t>
-      </w:r>
-      <w:proofErr w:type="spellEnd"/>
-      <w:r>
-        <w:t>:</w:t>
+        <w:t xml:space="preserve">                    ticketSummary.total_running_tt,</w:t>
+      </w:r>
+    </w:p>
+    <w:p>
+      <w:r>
+        <w:t xml:space="preserve">                color: COLORS.running,</w:t>
+      </w:r>
+    </w:p>
+    <w:p>
+      <w:r>
+        <w:t xml:space="preserve">                dotClass: "bg-amber-500",</w:t>
+      </w:r>
+    </w:p>
+    <w:p>
+      <w:r>
+        <w:t xml:space="preserve">                valueClass:</w:t>
       </w:r>
     </w:p>
     <w:p>
@@ -2323,15 +1811,7 @@
     <w:p>
       <w:r>
         <w:lastRenderedPageBreak/>
-        <w:t xml:space="preserve">                </w:t>
-      </w:r>
-      <w:proofErr w:type="spellStart"/>
-      <w:r>
-        <w:t>borderClass</w:t>
-      </w:r>
-      <w:proofErr w:type="spellEnd"/>
-      <w:r>
-        <w:t>:</w:t>
+        <w:t xml:space="preserve">                borderClass:</w:t>
       </w:r>
     </w:p>
     <w:p>
@@ -2341,15 +1821,7 @@
     </w:p>
     <w:p>
       <w:r>
-        <w:t xml:space="preserve">                </w:t>
-      </w:r>
-      <w:proofErr w:type="spellStart"/>
-      <w:r>
-        <w:t>backgroundClass</w:t>
-      </w:r>
-      <w:proofErr w:type="spellEnd"/>
-      <w:r>
-        <w:t>:</w:t>
+        <w:t xml:space="preserve">                backgroundClass:</w:t>
       </w:r>
     </w:p>
     <w:p>
@@ -2374,15 +1846,7 @@
     </w:p>
     <w:p>
       <w:r>
-        <w:t xml:space="preserve">                </w:t>
-      </w:r>
-      <w:proofErr w:type="spellStart"/>
-      <w:r>
-        <w:t>shortLabel</w:t>
-      </w:r>
-      <w:proofErr w:type="spellEnd"/>
-      <w:r>
-        <w:t>: "Procurement TT",</w:t>
+        <w:t xml:space="preserve">                shortLabel: "Procurement TT",</w:t>
       </w:r>
     </w:p>
     <w:p>
@@ -2402,54 +1866,22 @@
     </w:p>
     <w:p>
       <w:r>
-        <w:t xml:space="preserve">                    </w:t>
-      </w:r>
-      <w:proofErr w:type="spellStart"/>
-      <w:r>
-        <w:t>ticketSummary.total_procurement_tt</w:t>
-      </w:r>
-      <w:proofErr w:type="spellEnd"/>
-      <w:r>
-        <w:t>,</w:t>
-      </w:r>
-    </w:p>
-    <w:p>
-      <w:r>
-        <w:t xml:space="preserve">                color: </w:t>
-      </w:r>
-      <w:proofErr w:type="spellStart"/>
-      <w:r>
-        <w:t>COLORS.procurement</w:t>
-      </w:r>
-      <w:proofErr w:type="spellEnd"/>
-      <w:r>
-        <w:t>,</w:t>
-      </w:r>
-    </w:p>
-    <w:p>
-      <w:r>
-        <w:t xml:space="preserve">                </w:t>
-      </w:r>
-      <w:proofErr w:type="spellStart"/>
-      <w:r>
-        <w:t>dotClass</w:t>
-      </w:r>
-      <w:proofErr w:type="spellEnd"/>
-      <w:r>
-        <w:t>: "bg-violet-500",</w:t>
-      </w:r>
-    </w:p>
-    <w:p>
-      <w:r>
-        <w:t xml:space="preserve">                </w:t>
-      </w:r>
-      <w:proofErr w:type="spellStart"/>
-      <w:r>
-        <w:t>valueClass</w:t>
-      </w:r>
-      <w:proofErr w:type="spellEnd"/>
-      <w:r>
-        <w:t>:</w:t>
+        <w:t xml:space="preserve">                    ticketSummary.total_procurement_tt,</w:t>
+      </w:r>
+    </w:p>
+    <w:p>
+      <w:r>
+        <w:t xml:space="preserve">                color: COLORS.procurement,</w:t>
+      </w:r>
+    </w:p>
+    <w:p>
+      <w:r>
+        <w:t xml:space="preserve">                dotClass: "bg-violet-500",</w:t>
+      </w:r>
+    </w:p>
+    <w:p>
+      <w:r>
+        <w:t xml:space="preserve">                valueClass:</w:t>
       </w:r>
     </w:p>
     <w:p>
@@ -2459,15 +1891,7 @@
     </w:p>
     <w:p>
       <w:r>
-        <w:t xml:space="preserve">                </w:t>
-      </w:r>
-      <w:proofErr w:type="spellStart"/>
-      <w:r>
-        <w:t>borderClass</w:t>
-      </w:r>
-      <w:proofErr w:type="spellEnd"/>
-      <w:r>
-        <w:t>:</w:t>
+        <w:t xml:space="preserve">                borderClass:</w:t>
       </w:r>
     </w:p>
     <w:p>
@@ -2477,15 +1901,7 @@
     </w:p>
     <w:p>
       <w:r>
-        <w:t xml:space="preserve">                </w:t>
-      </w:r>
-      <w:proofErr w:type="spellStart"/>
-      <w:r>
-        <w:t>backgroundClass</w:t>
-      </w:r>
-      <w:proofErr w:type="spellEnd"/>
-      <w:r>
-        <w:t>:</w:t>
+        <w:t xml:space="preserve">                backgroundClass:</w:t>
       </w:r>
     </w:p>
     <w:p>
@@ -2505,15 +1921,7 @@
     </w:p>
     <w:p>
       <w:r>
-        <w:t xml:space="preserve">        [</w:t>
-      </w:r>
-      <w:proofErr w:type="spellStart"/>
-      <w:r>
-        <w:t>ticketSummary</w:t>
-      </w:r>
-      <w:proofErr w:type="spellEnd"/>
-      <w:r>
-        <w:t>]</w:t>
+        <w:t xml:space="preserve">        [ticketSummary]</w:t>
       </w:r>
     </w:p>
     <w:p>
@@ -2549,41 +1957,17 @@
     </w:p>
     <w:p>
       <w:r>
-        <w:t>/dashboard/</w:t>
-      </w:r>
-      <w:proofErr w:type="spellStart"/>
-      <w:r>
-        <w:t>trouble-ticket-overview?range</w:t>
-      </w:r>
-      <w:proofErr w:type="spellEnd"/>
-      <w:r>
-        <w:t>=7d</w:t>
-      </w:r>
-    </w:p>
-    <w:p>
-      <w:r>
-        <w:t>/dashboard/</w:t>
-      </w:r>
-      <w:proofErr w:type="spellStart"/>
-      <w:r>
-        <w:t>trouble-ticket-overview?range</w:t>
-      </w:r>
-      <w:proofErr w:type="spellEnd"/>
-      <w:r>
-        <w:t>=30d</w:t>
-      </w:r>
-    </w:p>
-    <w:p>
-      <w:r>
-        <w:t>/dashboard/</w:t>
-      </w:r>
-      <w:proofErr w:type="spellStart"/>
-      <w:r>
-        <w:t>trouble-ticket-overview?range</w:t>
-      </w:r>
-      <w:proofErr w:type="spellEnd"/>
-      <w:r>
-        <w:t>=3m</w:t>
+        <w:t>/dashboard/trouble-ticket-overview?range=7d</w:t>
+      </w:r>
+    </w:p>
+    <w:p>
+      <w:r>
+        <w:t>/dashboard/trouble-ticket-overview?range=30d</w:t>
+      </w:r>
+    </w:p>
+    <w:p>
+      <w:r>
+        <w:t>/dashboard/trouble-ticket-overview?range=3m</w:t>
       </w:r>
     </w:p>
     <w:p/>
@@ -2695,23 +2079,7 @@
     </w:p>
     <w:p>
       <w:r>
-        <w:t>GET /</w:t>
-      </w:r>
-      <w:proofErr w:type="spellStart"/>
-      <w:r>
-        <w:t>api</w:t>
-      </w:r>
-      <w:proofErr w:type="spellEnd"/>
-      <w:r>
-        <w:t>/v1/dashboard/</w:t>
-      </w:r>
-      <w:proofErr w:type="spellStart"/>
-      <w:r>
-        <w:t>trouble-ticket-overview?range</w:t>
-      </w:r>
-      <w:proofErr w:type="spellEnd"/>
-      <w:r>
-        <w:t>=7d</w:t>
+        <w:t>GET /api/v1/dashboard/trouble-ticket-overview?range=7d</w:t>
       </w:r>
     </w:p>
     <w:p/>
@@ -3214,41 +2582,17 @@
     </w:p>
     <w:p>
       <w:r>
-        <w:t xml:space="preserve">function </w:t>
-      </w:r>
-      <w:proofErr w:type="spellStart"/>
-      <w:r>
-        <w:t>getChartDescription</w:t>
-      </w:r>
-      <w:proofErr w:type="spellEnd"/>
-      <w:r>
-        <w:t>() {</w:t>
-      </w:r>
-    </w:p>
-    <w:p>
-      <w:r>
-        <w:t xml:space="preserve">    if (</w:t>
-      </w:r>
-      <w:proofErr w:type="spellStart"/>
-      <w:r>
-        <w:t>chartType</w:t>
-      </w:r>
-      <w:proofErr w:type="spellEnd"/>
-      <w:r>
-        <w:t xml:space="preserve"> === "area") {</w:t>
-      </w:r>
-    </w:p>
-    <w:p>
-      <w:r>
-        <w:t xml:space="preserve">        return `Historical ticket activity and workload for ${</w:t>
-      </w:r>
-      <w:proofErr w:type="spellStart"/>
-      <w:r>
-        <w:t>selectedRangeLabel.toLowerCase</w:t>
-      </w:r>
-      <w:proofErr w:type="spellEnd"/>
-      <w:r>
-        <w:t>()}`;</w:t>
+        <w:t>function getChartDescription() {</w:t>
+      </w:r>
+    </w:p>
+    <w:p>
+      <w:r>
+        <w:t xml:space="preserve">    if (chartType === "area") {</w:t>
+      </w:r>
+    </w:p>
+    <w:p>
+      <w:r>
+        <w:t xml:space="preserve">        return `Historical ticket activity and workload for ${selectedRangeLabel.toLowerCase()}`;</w:t>
       </w:r>
     </w:p>
     <w:p>
@@ -3259,28 +2603,12 @@
     <w:p/>
     <w:p>
       <w:r>
-        <w:t xml:space="preserve">    if (</w:t>
-      </w:r>
-      <w:proofErr w:type="spellStart"/>
-      <w:r>
-        <w:t>chartType</w:t>
-      </w:r>
-      <w:proofErr w:type="spellEnd"/>
-      <w:r>
-        <w:t xml:space="preserve"> === "pie") {</w:t>
-      </w:r>
-    </w:p>
-    <w:p>
-      <w:r>
-        <w:t xml:space="preserve">        return `Opened versus closed ticket activity for ${</w:t>
-      </w:r>
-      <w:proofErr w:type="spellStart"/>
-      <w:r>
-        <w:t>selectedRangeLabel.toLowerCase</w:t>
-      </w:r>
-      <w:proofErr w:type="spellEnd"/>
-      <w:r>
-        <w:t>()}`;</w:t>
+        <w:t xml:space="preserve">    if (chartType === "pie") {</w:t>
+      </w:r>
+    </w:p>
+    <w:p>
+      <w:r>
+        <w:t xml:space="preserve">        return `Opened versus closed ticket activity for ${selectedRangeLabel.toLowerCase()}`;</w:t>
       </w:r>
     </w:p>
     <w:p>
@@ -3306,6 +2634,47 @@
     </w:p>
     <w:p/>
     <w:p/>
+    <w:p/>
+    <w:p>
+      <w:r>
+        <w:lastRenderedPageBreak/>
+        <w:drawing>
+          <wp:inline distT="0" distB="0" distL="0" distR="0" wp14:anchorId="1FB783C0" wp14:editId="09865A9A">
+            <wp:extent cx="5943600" cy="3488055"/>
+            <wp:effectExtent l="0" t="0" r="0" b="0"/>
+            <wp:docPr id="388748010" name="Picture 1"/>
+            <wp:cNvGraphicFramePr>
+              <a:graphicFrameLocks xmlns:a="http://schemas.openxmlformats.org/drawingml/2006/main" noChangeAspect="1"/>
+            </wp:cNvGraphicFramePr>
+            <a:graphic xmlns:a="http://schemas.openxmlformats.org/drawingml/2006/main">
+              <a:graphicData uri="http://schemas.openxmlformats.org/drawingml/2006/picture">
+                <pic:pic xmlns:pic="http://schemas.openxmlformats.org/drawingml/2006/picture">
+                  <pic:nvPicPr>
+                    <pic:cNvPr id="388748010" name=""/>
+                    <pic:cNvPicPr/>
+                  </pic:nvPicPr>
+                  <pic:blipFill>
+                    <a:blip r:embed="rId10"/>
+                    <a:stretch>
+                      <a:fillRect/>
+                    </a:stretch>
+                  </pic:blipFill>
+                  <pic:spPr>
+                    <a:xfrm>
+                      <a:off x="0" y="0"/>
+                      <a:ext cx="5943600" cy="3488055"/>
+                    </a:xfrm>
+                    <a:prstGeom prst="rect">
+                      <a:avLst/>
+                    </a:prstGeom>
+                  </pic:spPr>
+                </pic:pic>
+              </a:graphicData>
+            </a:graphic>
+          </wp:inline>
+        </w:drawing>
+      </w:r>
+    </w:p>
     <w:sectPr>
       <w:pgSz w:w="12240" w:h="15840"/>
       <w:pgMar w:top="1440" w:right="1440" w:bottom="1440" w:left="1440" w:header="720" w:footer="720" w:gutter="0"/>

</xml_diff>